<commit_message>
W8 .docx: embed Figure 1 + Figure 2 PNGs + add GEOM/DIFF clarification
- Embed reports/figures/before_after_fp034.png and
  reports/figures/initial_pilot_latest_fes.png inline at 600 px width
  (preserve aspect ratio per file metadata: 1558x724 and 1347x857).
  .docx jumps from 25 KB to 419 KB.

- Section 2.1 gains a paragraph noting that ADAPTIVE=DIFF (the
  differential sigma scheme) was re-confirmed during this week's
  path-validation work, correcting an earlier mis-read of the SI as
  ADAPTIVE=GEOM. The DIFF reading is consistent across the SI re-read
  and the author email; the correction was propagated through the
  parameter-provenance docs so the GEOM mis-read does not resurface
  in tutorials.
</commit_message>
<xml_diff>
--- a/reports/WeeklyReport_Week8_2026-05-01.docx
+++ b/reports/WeeklyReport_Week8_2026-05-01.docx
@@ -2135,6 +2135,24 @@
           <w:sz w:val="22"/>
           <w:szCs w:val="22"/>
         </w:rPr>
+        <w:t xml:space="preserve">While re-validating the path setup I also re-confirmed that the path-CV uses ADAPTIVE=DIFF (the differential sigma scheme that adapts based on local differences between adjacent path frames), not GEOM as I had earlier mis-read from the SI. The DIFF reading is the one that comes back consistently from a clean SI re-read and from the author email. I propagated the correction across the parameter-provenance docs (PARAMETER_PROVENANCE.md, JACS2019_MetaDynamics_Parameters.md) so the GEOM mis-read does not resurface in tutorials.</w:t>
+      </w:r>
+    </w:p>
+    <w:p>
+      <w:pPr>
+        <w:spacing w:after="120"/>
+      </w:pPr>
+      <w:r>
+        <w:rPr>
+          <w:rFonts w:ascii="Arial" w:cs="Arial" w:eastAsia="Arial" w:hAnsi="Arial"/>
+          <w:b w:val="false"/>
+          <w:bCs w:val="false"/>
+          <w:i w:val="false"/>
+          <w:iCs w:val="false"/>
+          <w:color w:val="000000"/>
+          <w:sz w:val="22"/>
+          <w:szCs w:val="22"/>
+        </w:rPr>
         <w:t xml:space="preserve">The only downstream symptom was that the single-walker pilot stayed trapped at s less than 1.9 over 16 ns. After the realignment the same pilot now reaches s=14.05 at 24 ns and explores the full open-to-closed path. I logged the case as FP-034 with the rule that any future path-builder script must assert sequence identity above 50 percent before writing the path file.</w:t>
       </w:r>
     </w:p>
@@ -4754,6 +4772,52 @@
     </w:p>
     <w:p>
       <w:pPr>
+        <w:spacing w:after="120" w:before="120"/>
+        <w:jc w:val="center"/>
+      </w:pPr>
+      <w:r>
+        <w:drawing>
+          <wp:inline distT="0" distB="0" distL="0" distR="0">
+            <wp:extent cx="5715000" cy="2657475"/>
+            <wp:effectExtent t="0" r="0" b="0" l="0"/>
+            <wp:docPr id="1" name="" descr="" title=""/>
+            <wp:cNvGraphicFramePr>
+              <a:graphicFrameLocks xmlns:a="http://schemas.openxmlformats.org/drawingml/2006/main" noChangeAspect="1"/>
+            </wp:cNvGraphicFramePr>
+            <a:graphic xmlns:a="http://schemas.openxmlformats.org/drawingml/2006/main">
+              <a:graphicData uri="http://schemas.openxmlformats.org/drawingml/2006/picture">
+                <pic:pic xmlns:pic="http://schemas.openxmlformats.org/drawingml/2006/picture">
+                  <pic:nvPicPr>
+                    <pic:cNvPr id="0" name="" descr=""/>
+                    <pic:cNvPicPr>
+                      <a:picLocks noChangeAspect="1" noChangeArrowheads="1"/>
+                    </pic:cNvPicPr>
+                  </pic:nvPicPr>
+                  <pic:blipFill>
+                    <a:blip r:embed="rId7" cstate="none"/>
+                    <a:srcRect/>
+                    <a:stretch>
+                      <a:fillRect/>
+                    </a:stretch>
+                  </pic:blipFill>
+                  <pic:spPr bwMode="auto">
+                    <a:xfrm>
+                      <a:off x="0" y="0"/>
+                      <a:ext cx="5715000" cy="2657475"/>
+                    </a:xfrm>
+                    <a:prstGeom prst="rect">
+                      <a:avLst/>
+                    </a:prstGeom>
+                  </pic:spPr>
+                </pic:pic>
+              </a:graphicData>
+            </a:graphic>
+          </wp:inline>
+        </w:drawing>
+      </w:r>
+    </w:p>
+    <w:p>
+      <w:pPr>
         <w:spacing w:after="120"/>
       </w:pPr>
       <w:r>
@@ -4804,6 +4868,52 @@
           <w:szCs w:val="22"/>
         </w:rPr>
         <w:t xml:space="preserve">Figure 2 — reports/figures/initial_pilot_latest_fes.png. Latest Initial pilot 2D free energy surface at 24 ns, single-walker, in the JACS 2019 SI Fig S2/S3 style.</w:t>
+      </w:r>
+    </w:p>
+    <w:p>
+      <w:pPr>
+        <w:spacing w:after="120" w:before="120"/>
+        <w:jc w:val="center"/>
+      </w:pPr>
+      <w:r>
+        <w:drawing>
+          <wp:inline distT="0" distB="0" distL="0" distR="0">
+            <wp:extent cx="5715000" cy="3638550"/>
+            <wp:effectExtent t="0" r="0" b="0" l="0"/>
+            <wp:docPr id="1" name="" descr="" title=""/>
+            <wp:cNvGraphicFramePr>
+              <a:graphicFrameLocks xmlns:a="http://schemas.openxmlformats.org/drawingml/2006/main" noChangeAspect="1"/>
+            </wp:cNvGraphicFramePr>
+            <a:graphic xmlns:a="http://schemas.openxmlformats.org/drawingml/2006/main">
+              <a:graphicData uri="http://schemas.openxmlformats.org/drawingml/2006/picture">
+                <pic:pic xmlns:pic="http://schemas.openxmlformats.org/drawingml/2006/picture">
+                  <pic:nvPicPr>
+                    <pic:cNvPr id="0" name="" descr=""/>
+                    <pic:cNvPicPr>
+                      <a:picLocks noChangeAspect="1" noChangeArrowheads="1"/>
+                    </pic:cNvPicPr>
+                  </pic:nvPicPr>
+                  <pic:blipFill>
+                    <a:blip r:embed="rId8" cstate="none"/>
+                    <a:srcRect/>
+                    <a:stretch>
+                      <a:fillRect/>
+                    </a:stretch>
+                  </pic:blipFill>
+                  <pic:spPr bwMode="auto">
+                    <a:xfrm>
+                      <a:off x="0" y="0"/>
+                      <a:ext cx="5715000" cy="3638550"/>
+                    </a:xfrm>
+                    <a:prstGeom prst="rect">
+                      <a:avLst/>
+                    </a:prstGeom>
+                  </pic:spPr>
+                </pic:pic>
+              </a:graphicData>
+            </a:graphic>
+          </wp:inline>
+        </w:drawing>
       </w:r>
     </w:p>
     <w:p>

</xml_diff>

<commit_message>
W8 .docx: simplify Section 2.2 (v3 walker startup) — 4 paragraphs to 2
</commit_message>
<xml_diff>
--- a/reports/WeeklyReport_Week8_2026-05-01.docx
+++ b/reports/WeeklyReport_Week8_2026-05-01.docx
@@ -2170,79 +2170,43 @@
           <w:sz w:val="24"/>
           <w:szCs w:val="24"/>
         </w:rPr>
-        <w:t xml:space="preserve">2. v3 design and why three stages were needed</w:t>
-      </w:r>
-    </w:p>
-    <w:p>
-      <w:pPr>
-        <w:spacing w:after="120"/>
-      </w:pPr>
-      <w:r>
-        <w:rPr>
-          <w:rFonts w:ascii="Arial" w:cs="Arial" w:eastAsia="Arial" w:hAnsi="Arial"/>
-          <w:b w:val="false"/>
-          <w:bCs w:val="false"/>
-          <w:i w:val="false"/>
-          <w:iCs w:val="false"/>
-          <w:color w:val="000000"/>
-          <w:sz w:val="22"/>
-          <w:szCs w:val="22"/>
-        </w:rPr>
-        <w:t xml:space="preserve">The v2 10-walker run launched directly from coordinate-only start.gro files with continuation=no, gen_vel=yes, and PLUMED biasing turned on at the same time. All 10 walkers crashed inside 12 minutes with LINCS bond-stress on atoms 4463 through 4465. The root cause is that PLUMED started depositing path-CV bias before the velocities had Maxwell-Boltzmann thermalized at 350 K.</w:t>
-      </w:r>
-    </w:p>
-    <w:p>
-      <w:pPr>
-        <w:spacing w:after="120"/>
-      </w:pPr>
-      <w:r>
-        <w:rPr>
-          <w:rFonts w:ascii="Arial" w:cs="Arial" w:eastAsia="Arial" w:hAnsi="Arial"/>
-          <w:b w:val="false"/>
-          <w:bCs w:val="false"/>
-          <w:i w:val="false"/>
-          <w:iCs w:val="false"/>
-          <w:color w:val="000000"/>
-          <w:sz w:val="22"/>
-          <w:szCs w:val="22"/>
-        </w:rPr>
-        <w:t xml:space="preserve">Bond-stressed atoms cannot satisfy LINCS constraints under sudden bias and the integrator gives up with exit code 139.</w:t>
-      </w:r>
-    </w:p>
-    <w:p>
-      <w:pPr>
-        <w:spacing w:after="120"/>
-      </w:pPr>
-      <w:r>
-        <w:rPr>
-          <w:rFonts w:ascii="Arial" w:cs="Arial" w:eastAsia="Arial" w:hAnsi="Arial"/>
-          <w:b w:val="false"/>
-          <w:bCs w:val="false"/>
-          <w:i w:val="false"/>
-          <w:iCs w:val="false"/>
-          <w:color w:val="000000"/>
-          <w:sz w:val="22"/>
-          <w:szCs w:val="22"/>
-        </w:rPr>
-        <w:t xml:space="preserve">The v3 design splits the walker startup into three stages. Stage 1 is energy minimization for 1000 steps with PLUMED off. Stage 2 is NVT for 100 ps with PLUMED still off and gen_vel=yes, which initializes velocities at 350 K. Stage 3 is MetaDynamics with continuation=yes so that the velocities and box from nvt.cpt are inherited. PLUMED turns on for the first time at this stage.</w:t>
-      </w:r>
-    </w:p>
-    <w:p>
-      <w:pPr>
-        <w:spacing w:after="120"/>
-      </w:pPr>
-      <w:r>
-        <w:rPr>
-          <w:rFonts w:ascii="Arial" w:cs="Arial" w:eastAsia="Arial" w:hAnsi="Arial"/>
-          <w:b w:val="false"/>
-          <w:bCs w:val="false"/>
-          <w:i w:val="false"/>
-          <w:iCs w:val="false"/>
-          <w:color w:val="000000"/>
-          <w:sz w:val="22"/>
-          <w:szCs w:val="22"/>
-        </w:rPr>
-        <w:t xml:space="preserve">The smoke test (SLURM 45783311) ran 10 walkers for 1000+1000+1000 steps as a 30-minute sanity check. All 10 walkers passed: EM Maximum force in the range 938 to 986 kJ/mol/nm, 0 LINCS warnings, 0 atoms 4463 to 4465 errors, HILLS deposited at 1 hill per 2 ps, and 0 exit code 139. The production array launched immediately after the smoke pass.</w:t>
+        <w:t xml:space="preserve">2. v3 walker startup is split into three stages</w:t>
+      </w:r>
+    </w:p>
+    <w:p>
+      <w:pPr>
+        <w:spacing w:after="120"/>
+      </w:pPr>
+      <w:r>
+        <w:rPr>
+          <w:rFonts w:ascii="Arial" w:cs="Arial" w:eastAsia="Arial" w:hAnsi="Arial"/>
+          <w:b w:val="false"/>
+          <w:bCs w:val="false"/>
+          <w:i w:val="false"/>
+          <w:iCs w:val="false"/>
+          <w:color w:val="000000"/>
+          <w:sz w:val="22"/>
+          <w:szCs w:val="22"/>
+        </w:rPr>
+        <w:t xml:space="preserve">v2 crashed inside 12 minutes because the walker MDP initialized velocities (gen_vel=yes) and turned PLUMED biasing on at the same step; the bonds had not yet thermalized at 350 K when the bias started pushing, LINCS could not satisfy the constraints, and the integrator exited with code 139. v3 separates the two events: energy minimization with PLUMED off, then 100 ps NVT with PLUMED still off and gen_vel=yes (this is where velocities are actually initialized), then MetaDynamics with continuation=yes so the velocities and box are inherited from nvt.cpt and PLUMED only turns on at this final stage.</w:t>
+      </w:r>
+    </w:p>
+    <w:p>
+      <w:pPr>
+        <w:spacing w:after="120"/>
+      </w:pPr>
+      <w:r>
+        <w:rPr>
+          <w:rFonts w:ascii="Arial" w:cs="Arial" w:eastAsia="Arial" w:hAnsi="Arial"/>
+          <w:b w:val="false"/>
+          <w:bCs w:val="false"/>
+          <w:i w:val="false"/>
+          <w:iCs w:val="false"/>
+          <w:color w:val="000000"/>
+          <w:sz w:val="22"/>
+          <w:szCs w:val="22"/>
+        </w:rPr>
+        <w:t xml:space="preserve">The smoke test (SLURM 45783311, 30-minute sanity run on all 10 walkers) passed cleanly: zero LINCS warnings, zero exit-139s, HILLS deposited at the expected 1 hill per 2 ps. The production array launched immediately afterward.</w:t>
       </w:r>
     </w:p>
     <w:p>

</xml_diff>

<commit_message>
W8 .docx: scrub all v1/v2/v3 wording, use plain language (earlier/current/the fix)
</commit_message>
<xml_diff>
--- a/reports/WeeklyReport_Week8_2026-05-01.docx
+++ b/reports/WeeklyReport_Week8_2026-05-01.docx
@@ -478,7 +478,7 @@
           <w:sz w:val="22"/>
           <w:szCs w:val="22"/>
         </w:rPr>
-        <w:t xml:space="preserve">Phase 3: Build reward function for design loop (V2)</w:t>
+        <w:t xml:space="preserve">Phase 3: Closed-loop generation with MetaDynamics reward</w:t>
       </w:r>
     </w:p>
     <w:p>
@@ -739,7 +739,7 @@
                 <w:sz w:val="20"/>
                 <w:szCs w:val="20"/>
               </w:rPr>
-              <w:t xml:space="preserve">Diagnosed v1 10-walker scancel: homogeneous-start failure (FP-030)</w:t>
+              <w:t xml:space="preserve">Diagnosed first 10-walker scancel: all walkers used the same starting frame and stayed at the open conformation</w:t>
             </w:r>
           </w:p>
         </w:tc>
@@ -825,7 +825,7 @@
                 <w:sz w:val="20"/>
                 <w:szCs w:val="20"/>
               </w:rPr>
-              <w:t xml:space="preserve">Diagnosed v2 10-walker exit-139: LINCS atoms 4463 to 4465 plus missing velocity initialization</w:t>
+              <w:t xml:space="preserve">Diagnosed second 10-walker exit-139: LINCS bond-stress at startup because the MDP initialized velocities and turned PLUMED on at the same step</w:t>
             </w:r>
           </w:p>
         </w:tc>
@@ -911,7 +911,7 @@
                 <w:sz w:val="20"/>
                 <w:szCs w:val="20"/>
               </w:rPr>
-              <w:t xml:space="preserve">Designed v3 3-stage flow: EM 1000 steps, then NVT 100 ps PLUMED-off, then MetaD with continuation=yes</w:t>
+              <w:t xml:space="preserve">Designed the current 3-stage walker startup: EM 1000 steps, then NVT 100 ps with PLUMED off, then MetaDynamics with continuation=yes</w:t>
             </w:r>
           </w:p>
         </w:tc>
@@ -2170,25 +2170,25 @@
           <w:sz w:val="24"/>
           <w:szCs w:val="24"/>
         </w:rPr>
-        <w:t xml:space="preserve">2. v3 walker startup is split into three stages</w:t>
-      </w:r>
-    </w:p>
-    <w:p>
-      <w:pPr>
-        <w:spacing w:after="120"/>
-      </w:pPr>
-      <w:r>
-        <w:rPr>
-          <w:rFonts w:ascii="Arial" w:cs="Arial" w:eastAsia="Arial" w:hAnsi="Arial"/>
-          <w:b w:val="false"/>
-          <w:bCs w:val="false"/>
-          <w:i w:val="false"/>
-          <w:iCs w:val="false"/>
-          <w:color w:val="000000"/>
-          <w:sz w:val="22"/>
-          <w:szCs w:val="22"/>
-        </w:rPr>
-        <w:t xml:space="preserve">v2 crashed inside 12 minutes because the walker MDP initialized velocities (gen_vel=yes) and turned PLUMED biasing on at the same step; the bonds had not yet thermalized at 350 K when the bias started pushing, LINCS could not satisfy the constraints, and the integrator exited with code 139. v3 separates the two events: energy minimization with PLUMED off, then 100 ps NVT with PLUMED still off and gen_vel=yes (this is where velocities are actually initialized), then MetaDynamics with continuation=yes so the velocities and box are inherited from nvt.cpt and PLUMED only turns on at this final stage.</w:t>
+        <w:t xml:space="preserve">2. Walker startup needs three stages, not one</w:t>
+      </w:r>
+    </w:p>
+    <w:p>
+      <w:pPr>
+        <w:spacing w:after="120"/>
+      </w:pPr>
+      <w:r>
+        <w:rPr>
+          <w:rFonts w:ascii="Arial" w:cs="Arial" w:eastAsia="Arial" w:hAnsi="Arial"/>
+          <w:b w:val="false"/>
+          <w:bCs w:val="false"/>
+          <w:i w:val="false"/>
+          <w:iCs w:val="false"/>
+          <w:color w:val="000000"/>
+          <w:sz w:val="22"/>
+          <w:szCs w:val="22"/>
+        </w:rPr>
+        <w:t xml:space="preserve">The earlier 10-walker attempt crashed inside 12 minutes because the walker MDP initialized velocities (gen_vel=yes) and turned PLUMED biasing on at the same step; the bonds had not yet thermalized at 350 K when the bias started pushing, LINCS could not satisfy the constraints, and the integrator exited with code 139. The fix separates the two events into three sequential runs: energy minimization with PLUMED off, then 100 ps NVT with PLUMED still off and gen_vel=yes (this is where velocities are actually initialized), then MetaDynamics with continuation=yes so the velocities and box are inherited from nvt.cpt and PLUMED only turns on at this final stage.</w:t>
       </w:r>
     </w:p>
     <w:p>
@@ -3247,7 +3247,7 @@
           <w:sz w:val="24"/>
           <w:szCs w:val="24"/>
         </w:rPr>
-        <w:t xml:space="preserve">Problem 1: v2 10-walker LINCS exit code 139</w:t>
+        <w:t xml:space="preserve">Problem 1: the earlier 10-walker run crashed with LINCS exit 139</w:t>
       </w:r>
     </w:p>
     <w:p>
@@ -3265,7 +3265,7 @@
           <w:sz w:val="22"/>
           <w:szCs w:val="22"/>
         </w:rPr>
-        <w:t xml:space="preserve">What happened: All 10 walkers in production v2 crashed within 12 minutes. The Slurm logs all reported LINCS WARNING on atoms 4463 through 4465 followed by Fatal error and exit code 139.</w:t>
+        <w:t xml:space="preserve">What happened: in the earlier production attempt, all 10 walkers crashed within 12 minutes. The Slurm logs reported LINCS WARNING on a small set of bonded atoms followed by Fatal error and exit code 139.</w:t>
       </w:r>
     </w:p>
     <w:p>
@@ -3728,7 +3728,7 @@
           <w:sz w:val="22"/>
           <w:szCs w:val="22"/>
         </w:rPr>
-        <w:t xml:space="preserve">1. Debug the 10-walker production. I have observed LINCS warnings appearing mid-run on a subset of walkers (around 1 to 3 ns into the MetaDynamics phase, distinct from the v2 startup-LINCS signature). Next week's first job is to localize the failure mode (most likely a bias-rate / time-step interaction with water settling in high-bias regions) and decide between a shorter time step, a lower Gaussian height, or a damped early-stage bias schedule.</w:t>
+        <w:t xml:space="preserve">1. Debug the 10-walker production. I have observed LINCS warnings appearing mid-run on a subset of walkers (around 1 to 3 ns into the MetaDynamics phase, distinct from the earlier startup-LINCS signature). Next week's first job is to localize the failure mode (most likely a bias-rate / time-step interaction with water settling in high-bias regions) and decide between a shorter time step, a lower Gaussian height, or a damped early-stage bias schedule.</w:t>
       </w:r>
     </w:p>
     <w:p>

</xml_diff>

<commit_message>
W8 .docx: re-render Initial pilot FES in red-blue jet style (PM preferred)
</commit_message>
<xml_diff>
--- a/reports/WeeklyReport_Week8_2026-05-01.docx
+++ b/reports/WeeklyReport_Week8_2026-05-01.docx
@@ -4968,7 +4968,7 @@
       <w:r>
         <w:drawing>
           <wp:inline distT="0" distB="0" distL="0" distR="0">
-            <wp:extent cx="5715000" cy="3352800"/>
+            <wp:extent cx="5715000" cy="2609850"/>
             <wp:effectExtent t="0" r="0" b="0" l="0"/>
             <wp:docPr id="1" name="" descr="" title=""/>
             <wp:cNvGraphicFramePr>
@@ -4993,7 +4993,7 @@
                   <pic:spPr bwMode="auto">
                     <a:xfrm>
                       <a:off x="0" y="0"/>
-                      <a:ext cx="5715000" cy="3352800"/>
+                      <a:ext cx="5715000" cy="2609850"/>
                     </a:xfrm>
                     <a:prstGeom prst="rect">
                       <a:avLst/>

</xml_diff>

<commit_message>
W8 .docx: shorten references — author + paper title + 1-line role only
</commit_message>
<xml_diff>
--- a/reports/WeeklyReport_Week8_2026-05-01.docx
+++ b/reports/WeeklyReport_Week8_2026-05-01.docx
@@ -5074,277 +5074,277 @@
           <w:sz w:val="22"/>
           <w:szCs w:val="22"/>
         </w:rPr>
-        <w:t xml:space="preserve">1. Maria-Solano, M. A. et al. Enzyme conformational dynamics in the catalytic cycle of tryptophan synthase. JACS 141, 13049-13056 (2019). DOI: 10.1021/jacs.9b03646. Reference protocol I am replicating.</w:t>
-      </w:r>
-    </w:p>
-    <w:p>
-      <w:pPr>
-        <w:spacing w:after="120"/>
-      </w:pPr>
-      <w:r>
-        <w:rPr>
-          <w:rFonts w:ascii="Arial" w:cs="Arial" w:eastAsia="Arial" w:hAnsi="Arial"/>
-          <w:b w:val="false"/>
-          <w:bCs w:val="false"/>
-          <w:i w:val="false"/>
-          <w:iCs w:val="false"/>
-          <w:color w:val="000000"/>
-          <w:sz w:val="22"/>
-          <w:szCs w:val="22"/>
-        </w:rPr>
-        <w:t xml:space="preserve">2. Branduardi, D., Gervasio, F. L. and Parrinello, M. From A to B in free energy space. J. Chem. Phys. 126, 054103 (2007). DOI: 10.1063/1.2432340. Defines the path-CV LAMBDA = 2.3 / mean adjacent MSD.</w:t>
-      </w:r>
-    </w:p>
-    <w:p>
-      <w:pPr>
-        <w:spacing w:after="120"/>
-      </w:pPr>
-      <w:r>
-        <w:rPr>
-          <w:rFonts w:ascii="Arial" w:cs="Arial" w:eastAsia="Arial" w:hAnsi="Arial"/>
-          <w:b w:val="false"/>
-          <w:bCs w:val="false"/>
-          <w:i w:val="false"/>
-          <w:iCs w:val="false"/>
-          <w:color w:val="000000"/>
-          <w:sz w:val="22"/>
-          <w:szCs w:val="22"/>
-        </w:rPr>
-        <w:t xml:space="preserve">3. Tribello, G. A. et al. PLUMED 2: New feathers for an old bird. Comput. Phys. Commun. 185, 604-613 (2014). DOI: 10.1016/j.cpc.2013.09.018. The PLUMED engine I use for the bias.</w:t>
-      </w:r>
-    </w:p>
-    <w:p>
-      <w:pPr>
-        <w:spacing w:after="120"/>
-      </w:pPr>
-      <w:r>
-        <w:rPr>
-          <w:rFonts w:ascii="Arial" w:cs="Arial" w:eastAsia="Arial" w:hAnsi="Arial"/>
-          <w:b w:val="false"/>
-          <w:bCs w:val="false"/>
-          <w:i w:val="false"/>
-          <w:iCs w:val="false"/>
-          <w:color w:val="000000"/>
-          <w:sz w:val="22"/>
-          <w:szCs w:val="22"/>
-        </w:rPr>
-        <w:t xml:space="preserve">4. Henzler-Wildman, K. and Kern, D. Dynamic personalities of proteins. Nature 450, 964-972 (2007). DOI: 10.1038/nature06522. Establishes that enzyme function is governed by inter-state transition rates, not single-state occupancy.</w:t>
-      </w:r>
-    </w:p>
-    <w:p>
-      <w:pPr>
-        <w:spacing w:after="120"/>
-      </w:pPr>
-      <w:r>
-        <w:rPr>
-          <w:rFonts w:ascii="Arial" w:cs="Arial" w:eastAsia="Arial" w:hAnsi="Arial"/>
-          <w:b w:val="false"/>
-          <w:bCs w:val="false"/>
-          <w:i w:val="false"/>
-          <w:iCs w:val="false"/>
-          <w:color w:val="000000"/>
-          <w:sz w:val="22"/>
-          <w:szCs w:val="22"/>
-        </w:rPr>
-        <w:t xml:space="preserve">5. Boehr, D. D. et al. The dynamic energy landscape of dihydrofolate reductase catalysis. Science 313, 1638-1642 (2006). DOI: 10.1126/science.1130258. Direct evidence linking conformational transition rates to catalytic activity.</w:t>
-      </w:r>
-    </w:p>
-    <w:p>
-      <w:pPr>
-        <w:spacing w:after="120"/>
-      </w:pPr>
-      <w:r>
-        <w:rPr>
-          <w:rFonts w:ascii="Arial" w:cs="Arial" w:eastAsia="Arial" w:hAnsi="Arial"/>
-          <w:b w:val="false"/>
-          <w:bCs w:val="false"/>
-          <w:i w:val="false"/>
-          <w:iCs w:val="false"/>
-          <w:color w:val="000000"/>
-          <w:sz w:val="22"/>
-          <w:szCs w:val="22"/>
-        </w:rPr>
-        <w:t xml:space="preserve">6. Yang, J., Chu, W., Khalil, D., Astudillo, R., Wittmann, B. J., Arnold, F. H. and Yue, Y. Steering Generative Models with Experimental Data for Protein Fitness Optimization. NeurIPS 2025. arXiv:2505.15093. Plug-and-play classifier guidance / posterior sampling on discrete-diffusion protein language models, benchmarked on TrpB and CreiLOV at small N (~hundreds of labels). Supports the small-N feasibility for my Stage 1.</w:t>
-      </w:r>
-    </w:p>
-    <w:p>
-      <w:pPr>
-        <w:spacing w:after="120"/>
-      </w:pPr>
-      <w:r>
-        <w:rPr>
-          <w:rFonts w:ascii="Arial" w:cs="Arial" w:eastAsia="Arial" w:hAnsi="Arial"/>
-          <w:b w:val="false"/>
-          <w:bCs w:val="false"/>
-          <w:i w:val="false"/>
-          <w:iCs w:val="false"/>
-          <w:color w:val="000000"/>
-          <w:sz w:val="22"/>
-          <w:szCs w:val="22"/>
-        </w:rPr>
-        <w:t xml:space="preserve">7. Stocco, F., Artigues-Lleixa, M., Hunklinger, A., Widatalla, T., Guell, M. and Ferruz, N. Guiding Generative Protein Language Models with Reinforcement Learning. arXiv:2412.12979 (2024). Implements wDPO and GRPO RL fine-tuning of protein LMs (ZymCTRL family); produced low-nM EGFR binders. Reference recipe for my Stage 3 RL upper bound.</w:t>
-      </w:r>
-    </w:p>
-    <w:p>
-      <w:pPr>
-        <w:spacing w:after="120"/>
-      </w:pPr>
-      <w:r>
-        <w:rPr>
-          <w:rFonts w:ascii="Arial" w:cs="Arial" w:eastAsia="Arial" w:hAnsi="Arial"/>
-          <w:b w:val="false"/>
-          <w:bCs w:val="false"/>
-          <w:i w:val="false"/>
-          <w:iCs w:val="false"/>
-          <w:color w:val="000000"/>
-          <w:sz w:val="22"/>
-          <w:szCs w:val="22"/>
-        </w:rPr>
-        <w:t xml:space="preserve">8. Lambert, S. M. et al. Generative protein language modeling for tryptophan synthase variants. arXiv (2026). Supplies the 25M GenSLM checkpoint that Phase 2 targets.</w:t>
-      </w:r>
-    </w:p>
-    <w:p>
-      <w:pPr>
-        <w:spacing w:after="120"/>
-      </w:pPr>
-      <w:r>
-        <w:rPr>
-          <w:rFonts w:ascii="Arial" w:cs="Arial" w:eastAsia="Arial" w:hAnsi="Arial"/>
-          <w:b w:val="false"/>
-          <w:bCs w:val="false"/>
-          <w:i w:val="false"/>
-          <w:iCs w:val="false"/>
-          <w:color w:val="000000"/>
-          <w:sz w:val="22"/>
-          <w:szCs w:val="22"/>
-        </w:rPr>
-        <w:t xml:space="preserve">9. ByteDance Seed and collaborators. Scalable Spatio-Temporal SE(3) Diffusion for Long-Horizon Protein Dynamics. arXiv:2602.02128 (Feb 2026). Causal SE(3)-equivariant diffusion transformer that rolls out microsecond-scale all-atom protein trajectories from a sequence. Discussed in Section 2.4 as orthogonal: their direction is sequence to MD trajectory; mine is MD trajectory to sequence-scoring reward.</w:t>
-      </w:r>
-    </w:p>
-    <w:p>
-      <w:pPr>
-        <w:spacing w:after="120"/>
-      </w:pPr>
-      <w:r>
-        <w:rPr>
-          <w:rFonts w:ascii="Arial" w:cs="Arial" w:eastAsia="Arial" w:hAnsi="Arial"/>
-          <w:b w:val="false"/>
-          <w:bCs w:val="false"/>
-          <w:i w:val="false"/>
-          <w:iCs w:val="false"/>
-          <w:color w:val="000000"/>
-          <w:sz w:val="22"/>
-          <w:szCs w:val="22"/>
-        </w:rPr>
-        <w:t xml:space="preserve">10. Turner, A. M., Thiergart, G., Leech, G., Udell, D., Vazquez, J. J., Mini, U. and MacDiarmid, M. Steering Language Models With Activation Engineering. arXiv:2308.10248 (Aug 2023; v4 retitled Activation Addition: Steering Language Models Without Optimization). Adds a contrastively-derived steering vector to the residual stream at inference; weights stay frozen. Reference recipe for my Stage 2.</w:t>
-      </w:r>
-    </w:p>
-    <w:p>
-      <w:pPr>
-        <w:spacing w:after="120"/>
-      </w:pPr>
-      <w:r>
-        <w:rPr>
-          <w:rFonts w:ascii="Arial" w:cs="Arial" w:eastAsia="Arial" w:hAnsi="Arial"/>
-          <w:b w:val="false"/>
-          <w:bCs w:val="false"/>
-          <w:i w:val="false"/>
-          <w:iCs w:val="false"/>
-          <w:color w:val="000000"/>
-          <w:sz w:val="22"/>
-          <w:szCs w:val="22"/>
-        </w:rPr>
-        <w:t xml:space="preserve">11. Zou, A., Phan, L., Chen, S. et al. Representation Engineering: A Top-Down Approach to AI Transparency. arXiv:2310.01405 (Oct 2023). Identifies and manipulates population-level internal representations to steer high-level concepts in language models. Companion reference for my Stage 2.</w:t>
-      </w:r>
-    </w:p>
-    <w:p>
-      <w:pPr>
-        <w:spacing w:after="120"/>
-      </w:pPr>
-      <w:r>
-        <w:rPr>
-          <w:rFonts w:ascii="Arial" w:cs="Arial" w:eastAsia="Arial" w:hAnsi="Arial"/>
-          <w:b w:val="false"/>
-          <w:bCs w:val="false"/>
-          <w:i w:val="false"/>
-          <w:iCs w:val="false"/>
-          <w:color w:val="000000"/>
-          <w:sz w:val="22"/>
-          <w:szCs w:val="22"/>
-        </w:rPr>
-        <w:t xml:space="preserve">12. Liu, S.-Y., Wang, C.-Y., Yin, H., Molchanov, P., Wang, Y.-C. F., Cheng, K.-T. and Chen, M.-H. DoRA: Weight-Decomposed Low-Rank Adaptation. ICML 2024 Oral. arXiv:2402.09353. Decomposes pretrained weights into magnitude and direction; LoRA only on direction. Preferred adapter for my Stage 3 weight-level adjustment.</w:t>
-      </w:r>
-    </w:p>
-    <w:p>
-      <w:pPr>
-        <w:spacing w:after="120"/>
-      </w:pPr>
-      <w:r>
-        <w:rPr>
-          <w:rFonts w:ascii="Arial" w:cs="Arial" w:eastAsia="Arial" w:hAnsi="Arial"/>
-          <w:b w:val="false"/>
-          <w:bCs w:val="false"/>
-          <w:i w:val="false"/>
-          <w:iCs w:val="false"/>
-          <w:color w:val="000000"/>
-          <w:sz w:val="22"/>
-          <w:szCs w:val="22"/>
-        </w:rPr>
-        <w:t xml:space="preserve">13. Hu, E. J., Shen, Y., Wallis, P., Allen-Zhu, Z., Li, Y., Wang, S., Wang, L. and Chen, W. LoRA: Low-Rank Adaptation of Large Language Models. arXiv:2106.09685 (June 2021); ICLR 2022. The original low-rank adapter recipe that PiSSA, DoRA, and LoRA+ refine.</w:t>
-      </w:r>
-    </w:p>
-    <w:p>
-      <w:pPr>
-        <w:spacing w:after="120"/>
-      </w:pPr>
-      <w:r>
-        <w:rPr>
-          <w:rFonts w:ascii="Arial" w:cs="Arial" w:eastAsia="Arial" w:hAnsi="Arial"/>
-          <w:b w:val="false"/>
-          <w:bCs w:val="false"/>
-          <w:i w:val="false"/>
-          <w:iCs w:val="false"/>
-          <w:color w:val="000000"/>
-          <w:sz w:val="22"/>
-          <w:szCs w:val="22"/>
-        </w:rPr>
-        <w:t xml:space="preserve">14. Meng, F., Wang, Z. and Zhang, M. PiSSA: Principal Singular Values and Singular Vectors Adaptation of Large Language Models. arXiv:2404.02948 (2024). Initializes the LoRA matrices from the SVD of the pretrained weights so the adapter trains principal directions instead of random/zero updates. Preferred Stage 3 adapter for my plan.</w:t>
-      </w:r>
-    </w:p>
-    <w:p>
-      <w:pPr>
-        <w:spacing w:after="120"/>
-      </w:pPr>
-      <w:r>
-        <w:rPr>
-          <w:rFonts w:ascii="Arial" w:cs="Arial" w:eastAsia="Arial" w:hAnsi="Arial"/>
-          <w:b w:val="false"/>
-          <w:bCs w:val="false"/>
-          <w:i w:val="false"/>
-          <w:iCs w:val="false"/>
-          <w:color w:val="000000"/>
-          <w:sz w:val="22"/>
-          <w:szCs w:val="22"/>
-        </w:rPr>
-        <w:t xml:space="preserve">15. Hayou, S., Ghosh, N. and Yu, B. LoRA+: Efficient Low Rank Adaptation of Large Models. arXiv:2402.12354 (2024). Provides a corrected learning-rate / scaling rule for the original LoRA decomposition; used as the safe baseline alongside the original LoRA.</w:t>
-      </w:r>
-    </w:p>
-    <w:p>
-      <w:pPr>
-        <w:spacing w:after="120"/>
-      </w:pPr>
-      <w:r>
-        <w:rPr>
-          <w:rFonts w:ascii="Arial" w:cs="Arial" w:eastAsia="Arial" w:hAnsi="Arial"/>
-          <w:b w:val="false"/>
-          <w:bCs w:val="false"/>
-          <w:i w:val="false"/>
-          <w:iCs w:val="false"/>
-          <w:color w:val="000000"/>
-          <w:sz w:val="22"/>
-          <w:szCs w:val="22"/>
-        </w:rPr>
-        <w:t xml:space="preserve">16. Wu, Z., Arora, A., Wang, Z. et al. ReFT: Representation Finetuning for Language Models. arXiv:2404.03592 (2024). Discussed in Section 2.4 as a representation-level alternative that composes naturally with my Stage 2 activation steering.</w:t>
+        <w:t xml:space="preserve">1. Maria-Solano et al. "Enzyme conformational dynamics in the catalytic cycle of tryptophan synthase." The Osuna paper I am replicating.</w:t>
+      </w:r>
+    </w:p>
+    <w:p>
+      <w:pPr>
+        <w:spacing w:after="120"/>
+      </w:pPr>
+      <w:r>
+        <w:rPr>
+          <w:rFonts w:ascii="Arial" w:cs="Arial" w:eastAsia="Arial" w:hAnsi="Arial"/>
+          <w:b w:val="false"/>
+          <w:bCs w:val="false"/>
+          <w:i w:val="false"/>
+          <w:iCs w:val="false"/>
+          <w:color w:val="000000"/>
+          <w:sz w:val="22"/>
+          <w:szCs w:val="22"/>
+        </w:rPr>
+        <w:t xml:space="preserve">2. Branduardi, Gervasio and Parrinello. "From A to B in free energy space." Defines the path-CV λ formula used on the realigned path.</w:t>
+      </w:r>
+    </w:p>
+    <w:p>
+      <w:pPr>
+        <w:spacing w:after="120"/>
+      </w:pPr>
+      <w:r>
+        <w:rPr>
+          <w:rFonts w:ascii="Arial" w:cs="Arial" w:eastAsia="Arial" w:hAnsi="Arial"/>
+          <w:b w:val="false"/>
+          <w:bCs w:val="false"/>
+          <w:i w:val="false"/>
+          <w:iCs w:val="false"/>
+          <w:color w:val="000000"/>
+          <w:sz w:val="22"/>
+          <w:szCs w:val="22"/>
+        </w:rPr>
+        <w:t xml:space="preserve">3. Tribello et al. "PLUMED 2: New feathers for an old bird." The PLUMED engine I run the bias on.</w:t>
+      </w:r>
+    </w:p>
+    <w:p>
+      <w:pPr>
+        <w:spacing w:after="120"/>
+      </w:pPr>
+      <w:r>
+        <w:rPr>
+          <w:rFonts w:ascii="Arial" w:cs="Arial" w:eastAsia="Arial" w:hAnsi="Arial"/>
+          <w:b w:val="false"/>
+          <w:bCs w:val="false"/>
+          <w:i w:val="false"/>
+          <w:iCs w:val="false"/>
+          <w:color w:val="000000"/>
+          <w:sz w:val="22"/>
+          <w:szCs w:val="22"/>
+        </w:rPr>
+        <w:t xml:space="preserve">4. Henzler-Wildman and Kern. "Dynamic personalities of proteins." Background for why inter-state transition rates govern enzyme function.</w:t>
+      </w:r>
+    </w:p>
+    <w:p>
+      <w:pPr>
+        <w:spacing w:after="120"/>
+      </w:pPr>
+      <w:r>
+        <w:rPr>
+          <w:rFonts w:ascii="Arial" w:cs="Arial" w:eastAsia="Arial" w:hAnsi="Arial"/>
+          <w:b w:val="false"/>
+          <w:bCs w:val="false"/>
+          <w:i w:val="false"/>
+          <w:iCs w:val="false"/>
+          <w:color w:val="000000"/>
+          <w:sz w:val="22"/>
+          <w:szCs w:val="22"/>
+        </w:rPr>
+        <w:t xml:space="preserve">5. Boehr et al. "The dynamic energy landscape of dihydrofolate reductase catalysis." Direct experimental link between conformational transition rates and catalytic activity.</w:t>
+      </w:r>
+    </w:p>
+    <w:p>
+      <w:pPr>
+        <w:spacing w:after="120"/>
+      </w:pPr>
+      <w:r>
+        <w:rPr>
+          <w:rFonts w:ascii="Arial" w:cs="Arial" w:eastAsia="Arial" w:hAnsi="Arial"/>
+          <w:b w:val="false"/>
+          <w:bCs w:val="false"/>
+          <w:i w:val="false"/>
+          <w:iCs w:val="false"/>
+          <w:color w:val="000000"/>
+          <w:sz w:val="22"/>
+          <w:szCs w:val="22"/>
+        </w:rPr>
+        <w:t xml:space="preserve">6. Yang et al. "Steering Generative Models with Experimental Data for Protein Fitness Optimization." Closest small-N protein-LM TrpB benchmark; basis for Stage 1 small-N feasibility.</w:t>
+      </w:r>
+    </w:p>
+    <w:p>
+      <w:pPr>
+        <w:spacing w:after="120"/>
+      </w:pPr>
+      <w:r>
+        <w:rPr>
+          <w:rFonts w:ascii="Arial" w:cs="Arial" w:eastAsia="Arial" w:hAnsi="Arial"/>
+          <w:b w:val="false"/>
+          <w:bCs w:val="false"/>
+          <w:i w:val="false"/>
+          <w:iCs w:val="false"/>
+          <w:color w:val="000000"/>
+          <w:sz w:val="22"/>
+          <w:szCs w:val="22"/>
+        </w:rPr>
+        <w:t xml:space="preserve">7. Stocco et al. "Guiding Generative Protein Language Models with Reinforcement Learning." RL fine-tuning recipe for protein LMs; reference for my Stage 3 RL upper bound.</w:t>
+      </w:r>
+    </w:p>
+    <w:p>
+      <w:pPr>
+        <w:spacing w:after="120"/>
+      </w:pPr>
+      <w:r>
+        <w:rPr>
+          <w:rFonts w:ascii="Arial" w:cs="Arial" w:eastAsia="Arial" w:hAnsi="Arial"/>
+          <w:b w:val="false"/>
+          <w:bCs w:val="false"/>
+          <w:i w:val="false"/>
+          <w:iCs w:val="false"/>
+          <w:color w:val="000000"/>
+          <w:sz w:val="22"/>
+          <w:szCs w:val="22"/>
+        </w:rPr>
+        <w:t xml:space="preserve">8. Lambert et al. "Generative protein language modeling for tryptophan synthase variants." Supplies the GenSLM-25M checkpoint that Phase 2 targets.</w:t>
+      </w:r>
+    </w:p>
+    <w:p>
+      <w:pPr>
+        <w:spacing w:after="120"/>
+      </w:pPr>
+      <w:r>
+        <w:rPr>
+          <w:rFonts w:ascii="Arial" w:cs="Arial" w:eastAsia="Arial" w:hAnsi="Arial"/>
+          <w:b w:val="false"/>
+          <w:bCs w:val="false"/>
+          <w:i w:val="false"/>
+          <w:iCs w:val="false"/>
+          <w:color w:val="000000"/>
+          <w:sz w:val="22"/>
+          <w:szCs w:val="22"/>
+        </w:rPr>
+        <w:t xml:space="preserve">9. ByteDance Seed et al. "Scalable Spatio-Temporal SE(3) Diffusion for Long-Horizon Protein Dynamics." Generative MD direction; discussed as orthogonal in Section 2.4.</w:t>
+      </w:r>
+    </w:p>
+    <w:p>
+      <w:pPr>
+        <w:spacing w:after="120"/>
+      </w:pPr>
+      <w:r>
+        <w:rPr>
+          <w:rFonts w:ascii="Arial" w:cs="Arial" w:eastAsia="Arial" w:hAnsi="Arial"/>
+          <w:b w:val="false"/>
+          <w:bCs w:val="false"/>
+          <w:i w:val="false"/>
+          <w:iCs w:val="false"/>
+          <w:color w:val="000000"/>
+          <w:sz w:val="22"/>
+          <w:szCs w:val="22"/>
+        </w:rPr>
+        <w:t xml:space="preserve">10. Turner et al. "Steering Language Models With Activation Engineering" (later retitled "Activation Addition: Steering Language Models Without Optimization"). Reference for my Stage 2.</w:t>
+      </w:r>
+    </w:p>
+    <w:p>
+      <w:pPr>
+        <w:spacing w:after="120"/>
+      </w:pPr>
+      <w:r>
+        <w:rPr>
+          <w:rFonts w:ascii="Arial" w:cs="Arial" w:eastAsia="Arial" w:hAnsi="Arial"/>
+          <w:b w:val="false"/>
+          <w:bCs w:val="false"/>
+          <w:i w:val="false"/>
+          <w:iCs w:val="false"/>
+          <w:color w:val="000000"/>
+          <w:sz w:val="22"/>
+          <w:szCs w:val="22"/>
+        </w:rPr>
+        <w:t xml:space="preserve">11. Zou et al. "Representation Engineering: A Top-Down Approach to AI Transparency." Companion reference for Stage 2.</w:t>
+      </w:r>
+    </w:p>
+    <w:p>
+      <w:pPr>
+        <w:spacing w:after="120"/>
+      </w:pPr>
+      <w:r>
+        <w:rPr>
+          <w:rFonts w:ascii="Arial" w:cs="Arial" w:eastAsia="Arial" w:hAnsi="Arial"/>
+          <w:b w:val="false"/>
+          <w:bCs w:val="false"/>
+          <w:i w:val="false"/>
+          <w:iCs w:val="false"/>
+          <w:color w:val="000000"/>
+          <w:sz w:val="22"/>
+          <w:szCs w:val="22"/>
+        </w:rPr>
+        <w:t xml:space="preserve">12. Liu et al. "DoRA: Weight-Decomposed Low-Rank Adaptation." Second-choice Stage 3 adapter.</w:t>
+      </w:r>
+    </w:p>
+    <w:p>
+      <w:pPr>
+        <w:spacing w:after="120"/>
+      </w:pPr>
+      <w:r>
+        <w:rPr>
+          <w:rFonts w:ascii="Arial" w:cs="Arial" w:eastAsia="Arial" w:hAnsi="Arial"/>
+          <w:b w:val="false"/>
+          <w:bCs w:val="false"/>
+          <w:i w:val="false"/>
+          <w:iCs w:val="false"/>
+          <w:color w:val="000000"/>
+          <w:sz w:val="22"/>
+          <w:szCs w:val="22"/>
+        </w:rPr>
+        <w:t xml:space="preserve">13. Hu et al. "LoRA: Low-Rank Adaptation of Large Language Models." The original LoRA decomposition.</w:t>
+      </w:r>
+    </w:p>
+    <w:p>
+      <w:pPr>
+        <w:spacing w:after="120"/>
+      </w:pPr>
+      <w:r>
+        <w:rPr>
+          <w:rFonts w:ascii="Arial" w:cs="Arial" w:eastAsia="Arial" w:hAnsi="Arial"/>
+          <w:b w:val="false"/>
+          <w:bCs w:val="false"/>
+          <w:i w:val="false"/>
+          <w:iCs w:val="false"/>
+          <w:color w:val="000000"/>
+          <w:sz w:val="22"/>
+          <w:szCs w:val="22"/>
+        </w:rPr>
+        <w:t xml:space="preserve">14. Meng, Wang and Zhang. "PiSSA: Principal Singular Values and Singular Vectors Adaptation of Large Language Models." Preferred Stage 3 adapter.</w:t>
+      </w:r>
+    </w:p>
+    <w:p>
+      <w:pPr>
+        <w:spacing w:after="120"/>
+      </w:pPr>
+      <w:r>
+        <w:rPr>
+          <w:rFonts w:ascii="Arial" w:cs="Arial" w:eastAsia="Arial" w:hAnsi="Arial"/>
+          <w:b w:val="false"/>
+          <w:bCs w:val="false"/>
+          <w:i w:val="false"/>
+          <w:iCs w:val="false"/>
+          <w:color w:val="000000"/>
+          <w:sz w:val="22"/>
+          <w:szCs w:val="22"/>
+        </w:rPr>
+        <w:t xml:space="preserve">15. Hayou, Ghosh and Yu. "LoRA+: Efficient Low Rank Adaptation of Large Models." Safe Stage 3 baseline.</w:t>
+      </w:r>
+    </w:p>
+    <w:p>
+      <w:pPr>
+        <w:spacing w:after="120"/>
+      </w:pPr>
+      <w:r>
+        <w:rPr>
+          <w:rFonts w:ascii="Arial" w:cs="Arial" w:eastAsia="Arial" w:hAnsi="Arial"/>
+          <w:b w:val="false"/>
+          <w:bCs w:val="false"/>
+          <w:i w:val="false"/>
+          <w:iCs w:val="false"/>
+          <w:color w:val="000000"/>
+          <w:sz w:val="22"/>
+          <w:szCs w:val="22"/>
+        </w:rPr>
+        <w:t xml:space="preserve">16. Wu et al. "ReFT: Representation Finetuning for Language Models." Representation-level alternative considered for Stage 2.</w:t>
       </w:r>
     </w:p>
     <w:sectPr>

</xml_diff>